<commit_message>
Fill in author contributions and acknowledgements
CRediT-style author contributions for D.K., V.J.N. and A.A., and the
MIT UROP funding acknowledgement, in the tracked and clean manuscripts.

Co-Authored-By: Claude Opus 5.5 <noreply@anthropic.com>
Claude-Session: https://claude.ai/code/session_01USKzjsCgRSweCGWzXQWqYX
</commit_message>
<xml_diff>
--- a/site/index_nature_submission_clean.docx
+++ b/site/index_nature_submission_clean.docx
@@ -4272,7 +4272,7 @@
     </w:p>
     <w:p>
       <w:r>
-        <w:t>[To be completed.]</w:t>
+        <w:t xml:space="preserve">D.K. curated the data, wrote the software, carried out the investigation and formal analysis, produced the visualizations and wrote the original draft. V.J.N. conceived the study, designed the methodology, carried out formal analysis, supervised the work and wrote, reviewed and edited the manuscript. A.A. supervised the work, acquired funding and reviewed and edited the manuscript.</w:t>
       </w:r>
     </w:p>
     <w:p>
@@ -4298,7 +4298,7 @@
     </w:p>
     <w:p>
       <w:r>
-        <w:t>[To be completed.]</w:t>
+        <w:t xml:space="preserve">D.K. was supported by the MIT Undergraduate Research Opportunities Program (UROP).</w:t>
       </w:r>
     </w:p>
     <w:p>

</xml_diff>